<commit_message>
docs: add 1.0.1 changelog covering always-on rules and radio/space fixes
Co-Authored-By: Claude Opus 4.6 (1M context) <noreply@anthropic.com>
</commit_message>
<xml_diff>
--- a/docs/cf7-validate-documentation.docx
+++ b/docs/cf7-validate-documentation.docx
@@ -10489,6 +10489,170 @@
       </w:pPr>
       <w:r>
         <w:t>Loading spinner on submit button during AJAX submission</w:t>
+      </w:r>
+    </w:p>
+    <w:p/>
+    <w:p>
+      <w:r>
+        <w:t>1.0.1 — Always-On Rules, Radio Handling, Space Enforcement</w:t>
+      </w:r>
+    </w:p>
+    <w:p>
+      <w:r>
+        <w:t>Server-side changes:</w:t>
+      </w:r>
+    </w:p>
+    <w:p>
+      <w:pPr>
+        <w:pStyle w:val="ListBullet"/>
+      </w:pPr>
+      <w:r>
+        <w:t>Email, tel, and URL format checks now fire even when the field is not in the saved validation config — uses WPCF7_ContactForm::scan_form_tags() to discover format-typed inputs.</w:t>
+      </w:r>
+    </w:p>
+    <w:p>
+      <w:pPr>
+        <w:pStyle w:val="ListBullet"/>
+      </w:pPr>
+      <w:r>
+        <w:t>Leading/trailing-space detection now reads the pre-sanitised raw value (before sanitize_textarea_field trims it) so the check can flag the offence.</w:t>
+      </w:r>
+    </w:p>
+    <w:p>
+      <w:pPr>
+        <w:pStyle w:val="ListBullet"/>
+      </w:pPr>
+      <w:r>
+        <w:t>Textarea security-sanitise pattern scan moved to the raw value for the same reason — &lt;script&gt; tags were being stripped by WP sanitisation before we could flag them.</w:t>
+      </w:r>
+    </w:p>
+    <w:p>
+      <w:pPr>
+        <w:pStyle w:val="ListBullet"/>
+      </w:pPr>
+      <w:r>
+        <w:t>CF7-returned array values (select / checkbox) are unwrapped to a scalar string for non-group types.</w:t>
+      </w:r>
+    </w:p>
+    <w:p>
+      <w:pPr>
+        <w:pStyle w:val="ListBullet"/>
+      </w:pPr>
+      <w:r>
+        <w:t>Required check on checkbox / radio filters empty strings so an empty-string POST no longer satisfies the requirement.</w:t>
+      </w:r>
+    </w:p>
+    <w:p>
+      <w:pPr>
+        <w:pStyle w:val="ListBullet"/>
+      </w:pPr>
+      <w:r>
+        <w:t>SQL-keyword regex in strip_dangerous_patterns() tightened with context so common words like "select" or "update" no longer cause false positives.</w:t>
+      </w:r>
+    </w:p>
+    <w:p>
+      <w:r>
+        <w:t>Radio groups:</w:t>
+      </w:r>
+    </w:p>
+    <w:p>
+      <w:pPr>
+        <w:pStyle w:val="ListBullet"/>
+      </w:pPr>
+      <w:r>
+        <w:t>Contact Form 7 core always treats a radio group as required. The per-field Required toggle is now hidden for radio rows in the Validation tab and replaced by an explanatory note.</w:t>
+      </w:r>
+    </w:p>
+    <w:p>
+      <w:pPr>
+        <w:pStyle w:val="ListBullet"/>
+      </w:pPr>
+      <w:r>
+        <w:t>Radio groups always receive the red asterisk (never the "(Optional)" label), whether or not they are in the saved config.</w:t>
+      </w:r>
+    </w:p>
+    <w:p>
+      <w:pPr>
+        <w:pStyle w:val="ListBullet"/>
+      </w:pPr>
+      <w:r>
+        <w:t>Server-returned invalid_fields for radios are mirrored into our cfv-error-tip span via the wpcf7submit event, so errors show even when .wpcf7-not-valid-tip is hidden.</w:t>
+      </w:r>
+    </w:p>
+    <w:p>
+      <w:pPr>
+        <w:pStyle w:val="ListBullet"/>
+      </w:pPr>
+      <w:r>
+        <w:t>Generic browser / CF7 messages like "Please fill out this field." are rewritten to "Please select at least one {Label}" for radio / checkbox, or "{Label} is required" for everything else.</w:t>
+      </w:r>
+    </w:p>
+    <w:p>
+      <w:r>
+        <w:t>Space enforcement (config-independent):</w:t>
+      </w:r>
+    </w:p>
+    <w:p>
+      <w:pPr>
+        <w:pStyle w:val="ListBullet"/>
+      </w:pPr>
+      <w:r>
+        <w:t>email and tel inputs now block the space key on keydown and strip whitespace from pasted content. The browser type="email" sanitisation was hiding leading/trailing whitespace from .value, so an input-event strip alone was not enough.</w:t>
+      </w:r>
+    </w:p>
+    <w:p>
+      <w:pPr>
+        <w:pStyle w:val="ListBullet"/>
+      </w:pPr>
+      <w:r>
+        <w:t>text, textarea, url, number inputs block leading whitespace on input and strip trailing whitespace on blur.</w:t>
+      </w:r>
+    </w:p>
+    <w:p>
+      <w:pPr>
+        <w:pStyle w:val="ListBullet"/>
+      </w:pPr>
+      <w:r>
+        <w:t>These rules apply to every matching field on the form, whether configured or not.</w:t>
+      </w:r>
+    </w:p>
+    <w:p>
+      <w:r>
+        <w:t>Error-tip coverage:</w:t>
+      </w:r>
+    </w:p>
+    <w:p>
+      <w:pPr>
+        <w:pStyle w:val="ListBullet"/>
+      </w:pPr>
+      <w:r>
+        <w:t>The decorator now injects an empty cfv-error-tip span for every CF7 field on the form (second pass after the config loop), so server-returned errors always have a DOM target.</w:t>
+      </w:r>
+    </w:p>
+    <w:p>
+      <w:r>
+        <w:t>Browser HTML5 validation:</w:t>
+      </w:r>
+    </w:p>
+    <w:p>
+      <w:pPr>
+        <w:pStyle w:val="ListBullet"/>
+      </w:pPr>
+      <w:r>
+        <w:t>wpcf7_form_novalidate is now filtered to true — browser popups never fire on CF7 forms, so only our cfv-error-tip UI surfaces required/format errors.</w:t>
+      </w:r>
+    </w:p>
+    <w:p>
+      <w:r>
+        <w:t>Naming:</w:t>
+      </w:r>
+    </w:p>
+    <w:p>
+      <w:pPr>
+        <w:pStyle w:val="ListBullet"/>
+      </w:pPr>
+      <w:r>
+        <w:t>Plugin renamed from "CF7 Validate Pro" to CF7 Validate (WordPress.org submission prep). Folder is now cf7-validate/ with main file cf7-validate.php.</w:t>
       </w:r>
     </w:p>
     <w:sectPr>

</xml_diff>